<commit_message>
changed from toothbrush to toothpick
</commit_message>
<xml_diff>
--- a/cheek_cell_culture_protocol.docx
+++ b/cheek_cell_culture_protocol.docx
@@ -12,11 +12,11 @@
       </w:pPr>
       <w:r>
         <w:rPr/>
-        <w:t xml:space="preserve">Cheek Cell Culture + H2O2 Treatment Protocol </w:t>
-      </w:r>
-      <w:r>
-        <w:rPr/>
-        <w:t>v1.0.0</w:t>
+        <w:t>Cheek Cell Culture + H2O2 Treatment Protocol v1.0.</w:t>
+      </w:r>
+      <w:r>
+        <w:rPr/>
+        <w:t>1</w:t>
       </w:r>
     </w:p>
     <w:p>
@@ -79,19 +79,7 @@
       </w:pPr>
       <w:r>
         <w:rPr/>
-        <w:t xml:space="preserve">This is a protocol drafted by combining methods used by two papers, one paper discusses the collection and culturing of human “cheek cells”/”buccal cells” (Michalczyk et al. 2004) and the other discusses treating epithelial cells with hydrogen peroxide to study immunology (Okahashi et al. 2014). This </w:t>
-      </w:r>
-      <w:r>
-        <w:rPr/>
-        <w:t>protocol was initially developed based on these papers, and was then modified after some testing</w:t>
-      </w:r>
-      <w:r>
-        <w:rPr/>
-        <w:t xml:space="preserve">. </w:t>
-      </w:r>
-      <w:r>
-        <w:rPr/>
-        <w:t>This protocol is meant to be repeatable and robust within the context of a science fair, while also remaining viable on a limited schedule.</w:t>
+        <w:t>This is a protocol drafted by combining methods used by two papers, one paper discusses the collection and culturing of human “cheek cells”/”buccal cells” (Michalczyk et al. 2004) and the other discusses treating epithelial cells with hydrogen peroxide to study immunology (Okahashi et al. 2014). This protocol was initially developed based on these papers, and was then modified after some testing. This protocol is meant to be repeatable and robust within the context of a science fair, while also remaining viable on a limited schedule.</w:t>
       </w:r>
     </w:p>
     <w:p>
@@ -119,14 +107,7 @@
           <w:b/>
           <w:bCs/>
         </w:rPr>
-        <w:t xml:space="preserve">Day 1. </w:t>
-      </w:r>
-      <w:r>
-        <w:rPr>
-          <w:b/>
-          <w:bCs/>
-        </w:rPr>
-        <w:t xml:space="preserve">Cell Collection and Culture </w:t>
+        <w:t xml:space="preserve">Day 1. Cell Collection and Culture </w:t>
       </w:r>
       <w:r>
         <w:rPr>
@@ -153,8 +134,17 @@
           <w:i/>
           <w:iCs/>
         </w:rPr>
-        <w:t xml:space="preserve">- </w:t>
-      </w:r>
+        <w:t>- Required:</w:t>
+      </w:r>
+    </w:p>
+    <w:p>
+      <w:pPr>
+        <w:pStyle w:val="Normal"/>
+        <w:bidi w:val="0"/>
+        <w:spacing w:lineRule="auto" w:line="360"/>
+        <w:jc w:val="left"/>
+        <w:rPr/>
+      </w:pPr>
       <w:r>
         <w:rPr>
           <w:b w:val="false"/>
@@ -162,44 +152,8 @@
           <w:i/>
           <w:iCs/>
         </w:rPr>
-        <w:t>Required:</w:t>
-      </w:r>
-    </w:p>
-    <w:p>
-      <w:pPr>
-        <w:pStyle w:val="Normal"/>
-        <w:bidi w:val="0"/>
-        <w:spacing w:lineRule="auto" w:line="360"/>
-        <w:jc w:val="left"/>
-        <w:rPr/>
-      </w:pPr>
-      <w:r>
-        <w:rPr>
-          <w:b w:val="false"/>
-          <w:bCs w:val="false"/>
-          <w:i/>
-          <w:iCs/>
-        </w:rPr>
         <w:tab/>
-        <w:t>-</w:t>
-      </w:r>
-      <w:r>
-        <w:rPr>
-          <w:b w:val="false"/>
-          <w:bCs w:val="false"/>
-          <w:i/>
-          <w:iCs/>
-        </w:rPr>
-        <w:t>7</w:t>
-      </w:r>
-      <w:r>
-        <w:rPr>
-          <w:b w:val="false"/>
-          <w:bCs w:val="false"/>
-          <w:i/>
-          <w:iCs/>
-        </w:rPr>
-        <w:t xml:space="preserve">0 ml </w:t>
+        <w:t xml:space="preserve">-70 ml </w:t>
       </w:r>
       <w:r>
         <w:rPr>
@@ -217,8 +171,17 @@
           <w:i/>
           <w:iCs/>
         </w:rPr>
-        <w:t xml:space="preserve"> </w:t>
-      </w:r>
+        <w:t xml:space="preserve"> Sterile Saline</w:t>
+      </w:r>
+    </w:p>
+    <w:p>
+      <w:pPr>
+        <w:pStyle w:val="Normal"/>
+        <w:bidi w:val="0"/>
+        <w:spacing w:lineRule="auto" w:line="360"/>
+        <w:jc w:val="left"/>
+        <w:rPr/>
+      </w:pPr>
       <w:r>
         <w:rPr>
           <w:b w:val="false"/>
@@ -226,7 +189,8 @@
           <w:i/>
           <w:iCs/>
         </w:rPr>
-        <w:t>Sterile Saline</w:t>
+        <w:tab/>
+        <w:t>- 1x 50ml Eppendorf tube</w:t>
       </w:r>
     </w:p>
     <w:p>
@@ -245,7 +209,7 @@
           <w:iCs/>
         </w:rPr>
         <w:tab/>
-        <w:t>- 1x 50ml Eppendorf tube</w:t>
+        <w:t>- 10ml serological pipettes (have 5ml and 20ml on-hand might be handy but not required)</w:t>
       </w:r>
     </w:p>
     <w:p>
@@ -264,7 +228,7 @@
           <w:iCs/>
         </w:rPr>
         <w:tab/>
-        <w:t>- 10ml serological pipettes (have 5ml and 20ml on-hand might be handy but not required)</w:t>
+        <w:t>- 20ml mouthwash</w:t>
       </w:r>
     </w:p>
     <w:p>
@@ -283,17 +247,8 @@
           <w:iCs/>
         </w:rPr>
         <w:tab/>
-        <w:t>- 20ml mouthwash</w:t>
-      </w:r>
-    </w:p>
-    <w:p>
-      <w:pPr>
-        <w:pStyle w:val="Normal"/>
-        <w:bidi w:val="0"/>
-        <w:spacing w:lineRule="auto" w:line="360"/>
-        <w:jc w:val="left"/>
-        <w:rPr/>
-      </w:pPr>
+        <w:t xml:space="preserve">- </w:t>
+      </w:r>
       <w:r>
         <w:rPr>
           <w:b w:val="false"/>
@@ -301,8 +256,7 @@
           <w:i/>
           <w:iCs/>
         </w:rPr>
-        <w:tab/>
-        <w:t>- toothbrush</w:t>
+        <w:t>sterile toothpicks</w:t>
       </w:r>
     </w:p>
     <w:p>
@@ -339,8 +293,17 @@
           <w:i/>
           <w:iCs/>
         </w:rPr>
-        <w:t xml:space="preserve"> </w:t>
-      </w:r>
+        <w:t xml:space="preserve"> DMEM + 10% FBS + 1% penecillin-streptomycin (“cell culture media”)</w:t>
+      </w:r>
+    </w:p>
+    <w:p>
+      <w:pPr>
+        <w:pStyle w:val="Normal"/>
+        <w:bidi w:val="0"/>
+        <w:spacing w:lineRule="auto" w:line="360"/>
+        <w:jc w:val="left"/>
+        <w:rPr/>
+      </w:pPr>
       <w:r>
         <w:rPr>
           <w:b w:val="false"/>
@@ -348,7 +311,8 @@
           <w:i/>
           <w:iCs/>
         </w:rPr>
-        <w:t>DMEM + 10% FBS + 1% penecillin-streptomycin (“cell culture media”)</w:t>
+        <w:tab/>
+        <w:t>- hemocytometer</w:t>
       </w:r>
     </w:p>
     <w:p>
@@ -367,7 +331,7 @@
           <w:iCs/>
         </w:rPr>
         <w:tab/>
-        <w:t>- hemocytometer</w:t>
+        <w:t>- trypan blue</w:t>
       </w:r>
     </w:p>
     <w:p>
@@ -386,7 +350,7 @@
           <w:iCs/>
         </w:rPr>
         <w:tab/>
-        <w:t>- trypan blue</w:t>
+        <w:t>- micropipetter with pipette tips</w:t>
       </w:r>
     </w:p>
     <w:p>
@@ -405,25 +369,6 @@
           <w:iCs/>
         </w:rPr>
         <w:tab/>
-        <w:t>- micropipetter with pipette tips</w:t>
-      </w:r>
-    </w:p>
-    <w:p>
-      <w:pPr>
-        <w:pStyle w:val="Normal"/>
-        <w:bidi w:val="0"/>
-        <w:spacing w:lineRule="auto" w:line="360"/>
-        <w:jc w:val="left"/>
-        <w:rPr/>
-      </w:pPr>
-      <w:r>
-        <w:rPr>
-          <w:b w:val="false"/>
-          <w:bCs w:val="false"/>
-          <w:i/>
-          <w:iCs/>
-        </w:rPr>
-        <w:tab/>
         <w:t>- microcentrifuge tubes or small glass test tubes (for mixing cells and trypan blue)</w:t>
       </w:r>
     </w:p>
@@ -490,21 +435,14 @@
           <w:b w:val="false"/>
           <w:bCs w:val="false"/>
         </w:rPr>
-        <w:t xml:space="preserve">Vigorously brush teeth </w:t>
-      </w:r>
-      <w:r>
-        <w:rPr>
-          <w:b w:val="false"/>
-          <w:bCs w:val="false"/>
-        </w:rPr>
-        <w:t xml:space="preserve">for 60s </w:t>
-      </w:r>
-      <w:r>
-        <w:rPr>
-          <w:b w:val="false"/>
-          <w:bCs w:val="false"/>
-        </w:rPr>
-        <w:t>with a sterile toothbrush (using the same pressure used for normal brushing)</w:t>
+        <w:t xml:space="preserve">Gently rub the inside of your cheeks with a steril toothpick </w:t>
+      </w:r>
+      <w:r>
+        <w:rPr>
+          <w:b w:val="false"/>
+          <w:bCs w:val="false"/>
+        </w:rPr>
+        <w:t>for 60s</w:t>
       </w:r>
     </w:p>
     <w:p>
@@ -524,53 +462,16 @@
           <w:b w:val="false"/>
           <w:bCs w:val="false"/>
         </w:rPr>
-        <w:t>rinse mouth with 1</w:t>
-      </w:r>
-      <w:r>
-        <w:rPr>
-          <w:b w:val="false"/>
-          <w:bCs w:val="false"/>
-        </w:rPr>
-        <w:t>0</w:t>
-      </w:r>
-      <w:r>
-        <w:rPr>
-          <w:b w:val="false"/>
-          <w:bCs w:val="false"/>
-        </w:rPr>
-        <w:t xml:space="preserve">ml sterile </w:t>
-      </w:r>
-      <w:r>
-        <w:rPr>
-          <w:b w:val="false"/>
-          <w:bCs w:val="false"/>
-        </w:rPr>
-        <w:t xml:space="preserve">Saline </w:t>
-      </w:r>
-      <w:r>
-        <w:rPr>
-          <w:b w:val="false"/>
-          <w:bCs w:val="false"/>
-        </w:rPr>
-        <w:t xml:space="preserve">for 60s </w:t>
-      </w:r>
-      <w:r>
-        <w:rPr>
-          <w:b w:val="false"/>
-          <w:bCs w:val="false"/>
-          <w:i w:val="false"/>
-          <w:iCs w:val="false"/>
-        </w:rPr>
-        <w:t xml:space="preserve">and rinse the toothbrush with 10ml sterile </w:t>
-      </w:r>
-      <w:r>
-        <w:rPr>
-          <w:b w:val="false"/>
-          <w:bCs w:val="false"/>
-          <w:i w:val="false"/>
-          <w:iCs w:val="false"/>
-        </w:rPr>
-        <w:t>Saline.</w:t>
+        <w:t xml:space="preserve">rinse mouth with 10ml sterile Saline for 60s </w:t>
+      </w:r>
+      <w:r>
+        <w:rPr>
+          <w:b w:val="false"/>
+          <w:bCs w:val="false"/>
+          <w:i w:val="false"/>
+          <w:iCs w:val="false"/>
+        </w:rPr>
+        <w:t>and rinse the toothbrush with 10ml sterile Saline.</w:t>
       </w:r>
     </w:p>
     <w:p>
@@ -614,34 +515,7 @@
           <w:i w:val="false"/>
           <w:iCs w:val="false"/>
         </w:rPr>
-        <w:t xml:space="preserve">Wait </w:t>
-      </w:r>
-      <w:r>
-        <w:rPr>
-          <w:b w:val="false"/>
-          <w:bCs w:val="false"/>
-          <w:i w:val="false"/>
-          <w:iCs w:val="false"/>
-        </w:rPr>
-        <w:t>15</w:t>
-      </w:r>
-      <w:r>
-        <w:rPr>
-          <w:b w:val="false"/>
-          <w:bCs w:val="false"/>
-          <w:i w:val="false"/>
-          <w:iCs w:val="false"/>
-        </w:rPr>
-        <w:t xml:space="preserve"> minutes, and repeat steps 1-</w:t>
-      </w:r>
-      <w:r>
-        <w:rPr>
-          <w:b w:val="false"/>
-          <w:bCs w:val="false"/>
-          <w:i w:val="false"/>
-          <w:iCs w:val="false"/>
-        </w:rPr>
-        <w:t>4 for a total of two collections.</w:t>
+        <w:t>Wait 15 minutes, and repeat steps 1-4 for a total of two collections.</w:t>
       </w:r>
     </w:p>
     <w:p>
@@ -663,52 +537,7 @@
           <w:i w:val="false"/>
           <w:iCs w:val="false"/>
         </w:rPr>
-        <w:t>c</w:t>
-      </w:r>
-      <w:r>
-        <w:rPr>
-          <w:b w:val="false"/>
-          <w:bCs w:val="false"/>
-          <w:i w:val="false"/>
-          <w:iCs w:val="false"/>
-        </w:rPr>
-        <w:t xml:space="preserve">entrifuge rinses at 3000xg for 5 minutes, aspirate the supernatant and wash the </w:t>
-      </w:r>
-      <w:r>
-        <w:rPr>
-          <w:b w:val="false"/>
-          <w:bCs w:val="false"/>
-          <w:i w:val="false"/>
-          <w:iCs w:val="false"/>
-        </w:rPr>
-        <w:t xml:space="preserve">pellet of cells </w:t>
-      </w:r>
-      <w:r>
-        <w:rPr>
-          <w:b w:val="false"/>
-          <w:bCs w:val="false"/>
-          <w:i w:val="false"/>
-          <w:iCs w:val="false"/>
-        </w:rPr>
-        <w:t xml:space="preserve">by re-suspending in in </w:t>
-      </w:r>
-      <w:r>
-        <w:rPr>
-          <w:b w:val="false"/>
-          <w:bCs w:val="false"/>
-          <w:i w:val="false"/>
-          <w:iCs w:val="false"/>
-        </w:rPr>
-        <w:t>2</w:t>
-      </w:r>
-      <w:r>
-        <w:rPr>
-          <w:b w:val="false"/>
-          <w:bCs w:val="false"/>
-          <w:i w:val="false"/>
-          <w:iCs w:val="false"/>
-        </w:rPr>
-        <w:t>5ml sterile saline using a pipette.</w:t>
+        <w:t>centrifuge rinses at 3000xg for 5 minutes, aspirate the supernatant and wash the pellet of cells by re-suspending in in 25ml sterile saline using a pipette.</w:t>
       </w:r>
     </w:p>
     <w:p>
@@ -730,34 +559,7 @@
           <w:i w:val="false"/>
           <w:iCs w:val="false"/>
         </w:rPr>
-        <w:t>A</w:t>
-      </w:r>
-      <w:r>
-        <w:rPr>
-          <w:b w:val="false"/>
-          <w:bCs w:val="false"/>
-          <w:i w:val="false"/>
-          <w:iCs w:val="false"/>
-        </w:rPr>
-        <w:t xml:space="preserve">spirate </w:t>
-      </w:r>
-      <w:r>
-        <w:rPr>
-          <w:b w:val="false"/>
-          <w:bCs w:val="false"/>
-          <w:i w:val="false"/>
-          <w:iCs w:val="false"/>
-        </w:rPr>
-        <w:t xml:space="preserve">the supernatant </w:t>
-      </w:r>
-      <w:r>
-        <w:rPr>
-          <w:b w:val="false"/>
-          <w:bCs w:val="false"/>
-          <w:i w:val="false"/>
-          <w:iCs w:val="false"/>
-        </w:rPr>
-        <w:t>again and re-suspend in 2ml cell culture media</w:t>
+        <w:t>Aspirate the supernatant again and re-suspend in 2ml cell culture media</w:t>
       </w:r>
     </w:p>
     <w:p>
@@ -818,7 +620,33 @@
           <w:sz w:val="24"/>
           <w:vertAlign w:val="baseline"/>
         </w:rPr>
-        <w:t>Thuroughly vortex cell suspension and immediately pipette 50ul into a tube</w:t>
+        <w:t xml:space="preserve">Thuroughly vortex cell suspension and immediately pipette </w:t>
+      </w:r>
+      <w:r>
+        <w:rPr>
+          <w:b w:val="false"/>
+          <w:bCs w:val="false"/>
+          <w:i w:val="false"/>
+          <w:iCs w:val="false"/>
+          <w:position w:val="0"/>
+          <w:sz w:val="24"/>
+          <w:sz w:val="24"/>
+          <w:vertAlign w:val="baseline"/>
+        </w:rPr>
+        <w:t>4</w:t>
+      </w:r>
+      <w:r>
+        <w:rPr>
+          <w:b w:val="false"/>
+          <w:bCs w:val="false"/>
+          <w:i w:val="false"/>
+          <w:iCs w:val="false"/>
+          <w:position w:val="0"/>
+          <w:sz w:val="24"/>
+          <w:sz w:val="24"/>
+          <w:vertAlign w:val="baseline"/>
+        </w:rPr>
+        <w:t>0ul into a tube</w:t>
       </w:r>
     </w:p>
     <w:p>
@@ -844,7 +672,33 @@
           <w:sz w:val="24"/>
           <w:vertAlign w:val="baseline"/>
         </w:rPr>
-        <w:t>add 25ul clean cell culture media into the same tube</w:t>
+        <w:t>add 2</w:t>
+      </w:r>
+      <w:r>
+        <w:rPr>
+          <w:b w:val="false"/>
+          <w:bCs w:val="false"/>
+          <w:i w:val="false"/>
+          <w:iCs w:val="false"/>
+          <w:position w:val="0"/>
+          <w:sz w:val="24"/>
+          <w:sz w:val="24"/>
+          <w:vertAlign w:val="baseline"/>
+        </w:rPr>
+        <w:t>0</w:t>
+      </w:r>
+      <w:r>
+        <w:rPr>
+          <w:b w:val="false"/>
+          <w:bCs w:val="false"/>
+          <w:i w:val="false"/>
+          <w:iCs w:val="false"/>
+          <w:position w:val="0"/>
+          <w:sz w:val="24"/>
+          <w:sz w:val="24"/>
+          <w:vertAlign w:val="baseline"/>
+        </w:rPr>
+        <w:t>ul clean cell culture media into the same tube</w:t>
       </w:r>
     </w:p>
     <w:p>
@@ -870,7 +724,33 @@
           <w:sz w:val="24"/>
           <w:vertAlign w:val="baseline"/>
         </w:rPr>
-        <w:t>add 25ul Trypan Blue into the same tube</w:t>
+        <w:t>add 2</w:t>
+      </w:r>
+      <w:r>
+        <w:rPr>
+          <w:b w:val="false"/>
+          <w:bCs w:val="false"/>
+          <w:i w:val="false"/>
+          <w:iCs w:val="false"/>
+          <w:position w:val="0"/>
+          <w:sz w:val="24"/>
+          <w:sz w:val="24"/>
+          <w:vertAlign w:val="baseline"/>
+        </w:rPr>
+        <w:t>0</w:t>
+      </w:r>
+      <w:r>
+        <w:rPr>
+          <w:b w:val="false"/>
+          <w:bCs w:val="false"/>
+          <w:i w:val="false"/>
+          <w:iCs w:val="false"/>
+          <w:position w:val="0"/>
+          <w:sz w:val="24"/>
+          <w:sz w:val="24"/>
+          <w:vertAlign w:val="baseline"/>
+        </w:rPr>
+        <w:t>ul Trypan Blue into the same tube</w:t>
       </w:r>
     </w:p>
     <w:p>
@@ -948,20 +828,7 @@
           <w:sz w:val="24"/>
           <w:vertAlign w:val="baseline"/>
         </w:rPr>
-        <w:t xml:space="preserve">vortex and immediately add 10ul of stained cells into the hemocytometer </w:t>
-      </w:r>
-      <w:r>
-        <w:rPr>
-          <w:b w:val="false"/>
-          <w:bCs w:val="false"/>
-          <w:i w:val="false"/>
-          <w:iCs w:val="false"/>
-          <w:position w:val="0"/>
-          <w:sz w:val="24"/>
-          <w:sz w:val="24"/>
-          <w:vertAlign w:val="baseline"/>
-        </w:rPr>
-        <w:t>using the v-shaped notch on the side of the hemocytometer</w:t>
+        <w:t>vortex and immediately add 10ul of stained cells into the hemocytometer using the v-shaped notch on the side of the hemocytometer</w:t>
       </w:r>
     </w:p>
     <w:p>
@@ -1039,7 +906,59 @@
           <w:sz w:val="24"/>
           <w:vertAlign w:val="baseline"/>
         </w:rPr>
-        <w:t>multiply that number by 2 (because we diluted 50ul cells in 100ul final volume, our dilution factor is 2)</w:t>
+        <w:t xml:space="preserve">multiply that number by 2 (because we diluted </w:t>
+      </w:r>
+      <w:r>
+        <w:rPr>
+          <w:b w:val="false"/>
+          <w:bCs w:val="false"/>
+          <w:i w:val="false"/>
+          <w:iCs w:val="false"/>
+          <w:position w:val="0"/>
+          <w:sz w:val="24"/>
+          <w:sz w:val="24"/>
+          <w:vertAlign w:val="baseline"/>
+        </w:rPr>
+        <w:t>4</w:t>
+      </w:r>
+      <w:r>
+        <w:rPr>
+          <w:b w:val="false"/>
+          <w:bCs w:val="false"/>
+          <w:i w:val="false"/>
+          <w:iCs w:val="false"/>
+          <w:position w:val="0"/>
+          <w:sz w:val="24"/>
+          <w:sz w:val="24"/>
+          <w:vertAlign w:val="baseline"/>
+        </w:rPr>
+        <w:t xml:space="preserve">0ul cells in </w:t>
+      </w:r>
+      <w:r>
+        <w:rPr>
+          <w:b w:val="false"/>
+          <w:bCs w:val="false"/>
+          <w:i w:val="false"/>
+          <w:iCs w:val="false"/>
+          <w:position w:val="0"/>
+          <w:sz w:val="24"/>
+          <w:sz w:val="24"/>
+          <w:vertAlign w:val="baseline"/>
+        </w:rPr>
+        <w:t>80</w:t>
+      </w:r>
+      <w:r>
+        <w:rPr>
+          <w:b w:val="false"/>
+          <w:bCs w:val="false"/>
+          <w:i w:val="false"/>
+          <w:iCs w:val="false"/>
+          <w:position w:val="0"/>
+          <w:sz w:val="24"/>
+          <w:sz w:val="24"/>
+          <w:vertAlign w:val="baseline"/>
+        </w:rPr>
+        <w:t>ul final volume, our dilution factor is 2)</w:t>
       </w:r>
     </w:p>
     <w:p>
@@ -1103,34 +1022,7 @@
           <w:i w:val="false"/>
           <w:iCs w:val="false"/>
         </w:rPr>
-        <w:t xml:space="preserve">Calculate the amount of media needed to achieve a </w:t>
-      </w:r>
-      <w:r>
-        <w:rPr>
-          <w:b w:val="false"/>
-          <w:bCs w:val="false"/>
-          <w:i w:val="false"/>
-          <w:iCs w:val="false"/>
-        </w:rPr>
-        <w:t xml:space="preserve">concentration is </w:t>
-      </w:r>
-      <w:r>
-        <w:rPr>
-          <w:b w:val="false"/>
-          <w:bCs w:val="false"/>
-          <w:i w:val="false"/>
-          <w:iCs w:val="false"/>
-        </w:rPr>
-        <w:t>1</w:t>
-      </w:r>
-      <w:r>
-        <w:rPr>
-          <w:b w:val="false"/>
-          <w:bCs w:val="false"/>
-          <w:i w:val="false"/>
-          <w:iCs w:val="false"/>
-        </w:rPr>
-        <w:t>x10</w:t>
+        <w:t>Calculate the amount of media needed to achieve a concentration is 1x10</w:t>
       </w:r>
       <w:r>
         <w:rPr>
@@ -1153,42 +1045,38 @@
           <w:sz w:val="24"/>
           <w:vertAlign w:val="baseline"/>
         </w:rPr>
-        <w:t xml:space="preserve"> cells per </w:t>
-      </w:r>
-      <w:r>
-        <w:rPr>
-          <w:b w:val="false"/>
-          <w:bCs w:val="false"/>
-          <w:i w:val="false"/>
-          <w:iCs w:val="false"/>
-          <w:position w:val="0"/>
-          <w:sz w:val="24"/>
-          <w:sz w:val="24"/>
-          <w:vertAlign w:val="baseline"/>
-        </w:rPr>
-        <w:t>ml using the following formula:</w:t>
-      </w:r>
-    </w:p>
-    <w:p>
-      <w:pPr>
-        <w:pStyle w:val="Normal"/>
-        <w:bidi w:val="0"/>
-        <w:spacing w:lineRule="auto" w:line="360"/>
-        <w:jc w:val="left"/>
-        <w:rPr>
-          <w:b w:val="false"/>
-          <w:bCs w:val="false"/>
-          <w:i w:val="false"/>
-          <w:i w:val="false"/>
-          <w:iCs w:val="false"/>
-          <w:position w:val="0"/>
-          <w:sz w:val="24"/>
-          <w:sz w:val="24"/>
-          <w:vertAlign w:val="baseline"/>
-        </w:rPr>
-      </w:pPr>
-      <w:r>
-        <w:rPr/>
+        <w:t xml:space="preserve"> cells per ml using the following formula:</w:t>
+      </w:r>
+    </w:p>
+    <w:p>
+      <w:pPr>
+        <w:pStyle w:val="Normal"/>
+        <w:bidi w:val="0"/>
+        <w:spacing w:lineRule="auto" w:line="360"/>
+        <w:jc w:val="left"/>
+        <w:rPr>
+          <w:b w:val="false"/>
+          <w:bCs w:val="false"/>
+          <w:i w:val="false"/>
+          <w:i w:val="false"/>
+          <w:iCs w:val="false"/>
+          <w:position w:val="0"/>
+          <w:sz w:val="24"/>
+          <w:sz w:val="24"/>
+          <w:vertAlign w:val="baseline"/>
+        </w:rPr>
+      </w:pPr>
+      <w:r>
+        <w:rPr>
+          <w:b w:val="false"/>
+          <w:bCs w:val="false"/>
+          <w:i w:val="false"/>
+          <w:iCs w:val="false"/>
+          <w:position w:val="0"/>
+          <w:sz w:val="24"/>
+          <w:sz w:val="24"/>
+          <w:vertAlign w:val="baseline"/>
+        </w:rPr>
       </w:r>
     </w:p>
     <w:p>
@@ -1234,10 +1122,27 @@
           <w:iCs w:val="false"/>
           <w:position w:val="0"/>
           <w:sz w:val="24"/>
-          <w:vertAlign w:val="baseline"/>
-        </w:rPr>
-      </w:pPr>
-      <w:r>
+          <w:sz w:val="24"/>
+          <w:vertAlign w:val="baseline"/>
+        </w:rPr>
+      </w:pPr>
+      <w:r>
+        <w:rPr>
+          <w:i w:val="false"/>
+          <w:iCs w:val="false"/>
+          <w:position w:val="0"/>
+          <w:sz w:val="24"/>
+          <w:sz w:val="24"/>
+          <w:vertAlign w:val="baseline"/>
+        </w:rPr>
+      </w:r>
+    </w:p>
+    <w:p>
+      <w:pPr>
+        <w:pStyle w:val="Normal"/>
+        <w:bidi w:val="0"/>
+        <w:spacing w:lineRule="auto" w:line="360"/>
+        <w:jc w:val="left"/>
         <w:rPr>
           <w:rFonts w:ascii="Lucida Sans Unicode" w:hAnsi="Lucida Sans Unicode"/>
           <w:b/>
@@ -1245,6 +1150,77 @@
           <w:sz w:val="20"/>
           <w:szCs w:val="20"/>
         </w:rPr>
+      </w:pPr>
+      <w:r>
+        <w:rPr>
+          <w:rFonts w:ascii="Lucida Sans Unicode" w:hAnsi="Lucida Sans Unicode"/>
+          <w:b/>
+          <w:bCs/>
+          <w:i w:val="false"/>
+          <w:iCs w:val="false"/>
+          <w:position w:val="0"/>
+          <w:sz w:val="20"/>
+          <w:sz w:val="20"/>
+          <w:szCs w:val="20"/>
+          <w:vertAlign w:val="baseline"/>
+        </w:rPr>
+        <w:tab/>
+        <w:t>[Total # of cells collected] / [1x10</w:t>
+      </w:r>
+      <w:r>
+        <w:rPr>
+          <w:rFonts w:ascii="Lucida Sans Unicode" w:hAnsi="Lucida Sans Unicode"/>
+          <w:b/>
+          <w:bCs/>
+          <w:i w:val="false"/>
+          <w:iCs w:val="false"/>
+          <w:sz w:val="20"/>
+          <w:szCs w:val="20"/>
+          <w:vertAlign w:val="superscript"/>
+        </w:rPr>
+        <w:t>6</w:t>
+      </w:r>
+      <w:r>
+        <w:rPr>
+          <w:rFonts w:ascii="Lucida Sans Unicode" w:hAnsi="Lucida Sans Unicode"/>
+          <w:b/>
+          <w:bCs/>
+          <w:i w:val="false"/>
+          <w:iCs w:val="false"/>
+          <w:position w:val="0"/>
+          <w:sz w:val="20"/>
+          <w:sz w:val="20"/>
+          <w:szCs w:val="20"/>
+          <w:vertAlign w:val="baseline"/>
+        </w:rPr>
+        <w:t xml:space="preserve"> cells/ml] = Final volume of media required</w:t>
+      </w:r>
+    </w:p>
+    <w:p>
+      <w:pPr>
+        <w:pStyle w:val="Normal"/>
+        <w:bidi w:val="0"/>
+        <w:spacing w:lineRule="auto" w:line="360"/>
+        <w:jc w:val="left"/>
+        <w:rPr>
+          <w:i w:val="false"/>
+          <w:i w:val="false"/>
+          <w:iCs w:val="false"/>
+          <w:position w:val="0"/>
+          <w:sz w:val="24"/>
+          <w:sz w:val="24"/>
+          <w:vertAlign w:val="baseline"/>
+        </w:rPr>
+      </w:pPr>
+      <w:r>
+        <w:rPr>
+          <w:i w:val="false"/>
+          <w:iCs w:val="false"/>
+          <w:position w:val="0"/>
+          <w:sz w:val="24"/>
+          <w:sz w:val="24"/>
+          <w:vertAlign w:val="baseline"/>
+        </w:rPr>
       </w:r>
     </w:p>
     <w:p>
@@ -1275,120 +1251,6 @@
           <w:vertAlign w:val="baseline"/>
         </w:rPr>
         <w:tab/>
-        <w:t>[Total # of cells collected] / [</w:t>
-      </w:r>
-      <w:r>
-        <w:rPr>
-          <w:rFonts w:ascii="Lucida Sans Unicode" w:hAnsi="Lucida Sans Unicode"/>
-          <w:b/>
-          <w:bCs/>
-          <w:i w:val="false"/>
-          <w:iCs w:val="false"/>
-          <w:position w:val="0"/>
-          <w:sz w:val="20"/>
-          <w:sz w:val="20"/>
-          <w:szCs w:val="20"/>
-          <w:vertAlign w:val="baseline"/>
-        </w:rPr>
-        <w:t>1</w:t>
-      </w:r>
-      <w:r>
-        <w:rPr>
-          <w:rFonts w:ascii="Lucida Sans Unicode" w:hAnsi="Lucida Sans Unicode"/>
-          <w:b/>
-          <w:bCs/>
-          <w:i w:val="false"/>
-          <w:iCs w:val="false"/>
-          <w:position w:val="0"/>
-          <w:sz w:val="20"/>
-          <w:sz w:val="20"/>
-          <w:szCs w:val="20"/>
-          <w:vertAlign w:val="baseline"/>
-        </w:rPr>
-        <w:t>x10</w:t>
-      </w:r>
-      <w:r>
-        <w:rPr>
-          <w:rFonts w:ascii="Lucida Sans Unicode" w:hAnsi="Lucida Sans Unicode"/>
-          <w:b/>
-          <w:bCs/>
-          <w:i w:val="false"/>
-          <w:iCs w:val="false"/>
-          <w:sz w:val="20"/>
-          <w:szCs w:val="20"/>
-          <w:vertAlign w:val="superscript"/>
-        </w:rPr>
-        <w:t>6</w:t>
-      </w:r>
-      <w:r>
-        <w:rPr>
-          <w:rFonts w:ascii="Lucida Sans Unicode" w:hAnsi="Lucida Sans Unicode"/>
-          <w:b/>
-          <w:bCs/>
-          <w:i w:val="false"/>
-          <w:iCs w:val="false"/>
-          <w:position w:val="0"/>
-          <w:sz w:val="20"/>
-          <w:sz w:val="20"/>
-          <w:szCs w:val="20"/>
-          <w:vertAlign w:val="baseline"/>
-        </w:rPr>
-        <w:t xml:space="preserve"> cells/ml] = Final volume of media required</w:t>
-      </w:r>
-    </w:p>
-    <w:p>
-      <w:pPr>
-        <w:pStyle w:val="Normal"/>
-        <w:bidi w:val="0"/>
-        <w:spacing w:lineRule="auto" w:line="360"/>
-        <w:jc w:val="left"/>
-        <w:rPr>
-          <w:i w:val="false"/>
-          <w:i w:val="false"/>
-          <w:iCs w:val="false"/>
-          <w:position w:val="0"/>
-          <w:sz w:val="24"/>
-          <w:vertAlign w:val="baseline"/>
-        </w:rPr>
-      </w:pPr>
-      <w:r>
-        <w:rPr>
-          <w:rFonts w:ascii="Lucida Sans Unicode" w:hAnsi="Lucida Sans Unicode"/>
-          <w:b/>
-          <w:bCs/>
-          <w:sz w:val="20"/>
-          <w:szCs w:val="20"/>
-        </w:rPr>
-      </w:r>
-    </w:p>
-    <w:p>
-      <w:pPr>
-        <w:pStyle w:val="Normal"/>
-        <w:bidi w:val="0"/>
-        <w:spacing w:lineRule="auto" w:line="360"/>
-        <w:jc w:val="left"/>
-        <w:rPr>
-          <w:rFonts w:ascii="Lucida Sans Unicode" w:hAnsi="Lucida Sans Unicode"/>
-          <w:b/>
-          <w:bCs/>
-          <w:sz w:val="20"/>
-          <w:szCs w:val="20"/>
-        </w:rPr>
-      </w:pPr>
-      <w:r>
-        <w:rPr>
-          <w:rFonts w:ascii="Lucida Sans Unicode" w:hAnsi="Lucida Sans Unicode"/>
-          <w:b/>
-          <w:bCs/>
-          <w:i w:val="false"/>
-          <w:iCs w:val="false"/>
-          <w:position w:val="0"/>
-          <w:sz w:val="20"/>
-          <w:sz w:val="20"/>
-          <w:szCs w:val="20"/>
-          <w:vertAlign w:val="baseline"/>
-        </w:rPr>
-        <w:tab/>
         <w:t>[Final volume required] – 2ml (from step 8) = amount of media to add (</w:t>
       </w:r>
       <w:r>
@@ -1405,7 +1267,7 @@
           <w:u w:val="single"/>
           <w:vertAlign w:val="baseline"/>
         </w:rPr>
-        <w:t xml:space="preserve">for </w:t>
+        <w:t>for next step</w:t>
       </w:r>
       <w:r>
         <w:rPr>
@@ -1418,22 +1280,6 @@
           <w:sz w:val="20"/>
           <w:sz w:val="20"/>
           <w:szCs w:val="20"/>
-          <w:u w:val="single"/>
-          <w:vertAlign w:val="baseline"/>
-        </w:rPr>
-        <w:t>next step</w:t>
-      </w:r>
-      <w:r>
-        <w:rPr>
-          <w:rFonts w:ascii="Lucida Sans Unicode" w:hAnsi="Lucida Sans Unicode"/>
-          <w:b/>
-          <w:bCs/>
-          <w:i w:val="false"/>
-          <w:iCs w:val="false"/>
-          <w:position w:val="0"/>
-          <w:sz w:val="20"/>
-          <w:sz w:val="20"/>
-          <w:szCs w:val="20"/>
           <w:vertAlign w:val="baseline"/>
         </w:rPr>
         <w:t>)</w:t>
@@ -1458,7 +1304,16 @@
         </w:rPr>
       </w:pPr>
       <w:r>
-        <w:rPr/>
+        <w:rPr>
+          <w:b w:val="false"/>
+          <w:bCs w:val="false"/>
+          <w:i w:val="false"/>
+          <w:iCs w:val="false"/>
+          <w:position w:val="0"/>
+          <w:sz w:val="24"/>
+          <w:sz w:val="24"/>
+          <w:vertAlign w:val="baseline"/>
+        </w:rPr>
       </w:r>
     </w:p>
     <w:p>
@@ -1485,35 +1340,7 @@
           <w:szCs w:val="24"/>
           <w:vertAlign w:val="baseline"/>
         </w:rPr>
-        <w:t xml:space="preserve">add media to achieve </w:t>
-      </w:r>
-      <w:r>
-        <w:rPr>
-          <w:b w:val="false"/>
-          <w:bCs w:val="false"/>
-          <w:i w:val="false"/>
-          <w:iCs w:val="false"/>
-          <w:position w:val="0"/>
-          <w:sz w:val="24"/>
-          <w:sz w:val="24"/>
-          <w:szCs w:val="24"/>
-          <w:vertAlign w:val="baseline"/>
-        </w:rPr>
-        <w:t>1</w:t>
-      </w:r>
-      <w:r>
-        <w:rPr>
-          <w:b w:val="false"/>
-          <w:bCs w:val="false"/>
-          <w:i w:val="false"/>
-          <w:iCs w:val="false"/>
-          <w:position w:val="0"/>
-          <w:sz w:val="24"/>
-          <w:sz w:val="24"/>
-          <w:szCs w:val="24"/>
-          <w:vertAlign w:val="baseline"/>
-        </w:rPr>
-        <w:t>x10</w:t>
+        <w:t>add media to achieve 1x10</w:t>
       </w:r>
       <w:r>
         <w:rPr>
@@ -1566,35 +1393,7 @@
           <w:szCs w:val="24"/>
           <w:vertAlign w:val="baseline"/>
         </w:rPr>
-        <w:t xml:space="preserve">Culture the cells </w:t>
-      </w:r>
-      <w:r>
-        <w:rPr>
-          <w:b w:val="false"/>
-          <w:bCs w:val="false"/>
-          <w:i w:val="false"/>
-          <w:iCs w:val="false"/>
-          <w:position w:val="0"/>
-          <w:sz w:val="24"/>
-          <w:sz w:val="24"/>
-          <w:szCs w:val="24"/>
-          <w:vertAlign w:val="baseline"/>
-        </w:rPr>
-        <w:t>overnight in a shaker at</w:t>
-      </w:r>
-      <w:r>
-        <w:rPr>
-          <w:b w:val="false"/>
-          <w:bCs w:val="false"/>
-          <w:i w:val="false"/>
-          <w:iCs w:val="false"/>
-          <w:position w:val="0"/>
-          <w:sz w:val="24"/>
-          <w:sz w:val="24"/>
-          <w:szCs w:val="24"/>
-          <w:vertAlign w:val="baseline"/>
-        </w:rPr>
-        <w:t xml:space="preserve"> 37</w:t>
+        <w:t>Culture the cells overnight in a shaker at 37</w:t>
       </w:r>
       <w:r>
         <w:rPr>
@@ -1627,21 +1426,7 @@
           <w:szCs w:val="24"/>
           <w:vertAlign w:val="baseline"/>
         </w:rPr>
-        <w:t xml:space="preserve"> C </w:t>
-      </w:r>
-      <w:r>
-        <w:rPr>
-          <w:b w:val="false"/>
-          <w:bCs w:val="false"/>
-          <w:i w:val="false"/>
-          <w:iCs w:val="false"/>
-          <w:position w:val="0"/>
-          <w:sz w:val="24"/>
-          <w:sz w:val="24"/>
-          <w:szCs w:val="24"/>
-          <w:vertAlign w:val="baseline"/>
-        </w:rPr>
-        <w:t>@ 225rpm</w:t>
+        <w:t xml:space="preserve"> C @ 225rpm</w:t>
       </w:r>
     </w:p>
     <w:p>
@@ -1682,7 +1467,7 @@
       <w:pPr>
         <w:pStyle w:val="Normal"/>
         <w:bidi w:val="0"/>
-        <w:spacing w:lineRule="auto" w:line="360"/>
+        <w:spacing w:lineRule="auto" w:line="360" w:before="0" w:after="0"/>
         <w:jc w:val="left"/>
         <w:rPr>
           <w:b w:val="false"/>
@@ -1729,21 +1514,7 @@
           <w:szCs w:val="24"/>
           <w:vertAlign w:val="baseline"/>
         </w:rPr>
-        <w:t xml:space="preserve">Day 2. </w:t>
-      </w:r>
-      <w:r>
-        <w:rPr>
-          <w:b/>
-          <w:bCs/>
-          <w:i w:val="false"/>
-          <w:iCs w:val="false"/>
-          <w:position w:val="0"/>
-          <w:sz w:val="24"/>
-          <w:sz w:val="24"/>
-          <w:szCs w:val="24"/>
-          <w:vertAlign w:val="baseline"/>
-        </w:rPr>
-        <w:t xml:space="preserve">H2O2 + polyphenol treatment </w:t>
+        <w:t xml:space="preserve">Day 2. H2O2 + polyphenol treatment </w:t>
       </w:r>
       <w:r>
         <w:rPr>
@@ -2159,21 +1930,7 @@
           <w:szCs w:val="24"/>
           <w:vertAlign w:val="baseline"/>
         </w:rPr>
-        <w:t xml:space="preserve">Dilute </w:t>
-      </w:r>
-      <w:r>
-        <w:rPr>
-          <w:b w:val="false"/>
-          <w:bCs w:val="false"/>
-          <w:i w:val="false"/>
-          <w:iCs w:val="false"/>
-          <w:position w:val="0"/>
-          <w:sz w:val="24"/>
-          <w:sz w:val="24"/>
-          <w:szCs w:val="24"/>
-          <w:vertAlign w:val="baseline"/>
-        </w:rPr>
-        <w:t>100ul rosemary extract in 900ul sterile saline (1:10 dilute)</w:t>
+        <w:t>Dilute 100ul rosemary extract in 900ul sterile saline (1:10 dilute)</w:t>
       </w:r>
     </w:p>
     <w:p>
@@ -2200,77 +1957,7 @@
           <w:szCs w:val="24"/>
           <w:vertAlign w:val="baseline"/>
         </w:rPr>
-        <w:t xml:space="preserve">Treat the RE only and H2O2+RE tubes with a 1:100 </w:t>
-      </w:r>
-      <w:r>
-        <w:rPr>
-          <w:b w:val="false"/>
-          <w:bCs w:val="false"/>
-          <w:i w:val="false"/>
-          <w:iCs w:val="false"/>
-          <w:position w:val="0"/>
-          <w:sz w:val="24"/>
-          <w:sz w:val="24"/>
-          <w:szCs w:val="24"/>
-          <w:vertAlign w:val="baseline"/>
-        </w:rPr>
-        <w:t>ratio</w:t>
-      </w:r>
-      <w:r>
-        <w:rPr>
-          <w:b w:val="false"/>
-          <w:bCs w:val="false"/>
-          <w:i w:val="false"/>
-          <w:iCs w:val="false"/>
-          <w:position w:val="0"/>
-          <w:sz w:val="24"/>
-          <w:sz w:val="24"/>
-          <w:szCs w:val="24"/>
-          <w:vertAlign w:val="baseline"/>
-        </w:rPr>
-        <w:t xml:space="preserve"> of </w:t>
-      </w:r>
-      <w:r>
-        <w:rPr>
-          <w:b w:val="false"/>
-          <w:bCs w:val="false"/>
-          <w:i w:val="false"/>
-          <w:iCs w:val="false"/>
-          <w:position w:val="0"/>
-          <w:sz w:val="24"/>
-          <w:sz w:val="24"/>
-          <w:szCs w:val="24"/>
-          <w:vertAlign w:val="baseline"/>
-        </w:rPr>
-        <w:t xml:space="preserve">diluted </w:t>
-      </w:r>
-      <w:r>
-        <w:rPr>
-          <w:b w:val="false"/>
-          <w:bCs w:val="false"/>
-          <w:i w:val="false"/>
-          <w:iCs w:val="false"/>
-          <w:position w:val="0"/>
-          <w:sz w:val="24"/>
-          <w:sz w:val="24"/>
-          <w:szCs w:val="24"/>
-          <w:vertAlign w:val="baseline"/>
-        </w:rPr>
-        <w:t xml:space="preserve">rosemary extract (i.e. if the cell culture volume is </w:t>
-      </w:r>
-      <w:r>
-        <w:rPr>
-          <w:b w:val="false"/>
-          <w:bCs w:val="false"/>
-          <w:i w:val="false"/>
-          <w:iCs w:val="false"/>
-          <w:position w:val="0"/>
-          <w:sz w:val="24"/>
-          <w:sz w:val="24"/>
-          <w:szCs w:val="24"/>
-          <w:vertAlign w:val="baseline"/>
-        </w:rPr>
-        <w:t>500ul, treat with 5ul diluted RE)</w:t>
+        <w:t>Treat the RE only and H2O2+RE tubes with a 1:100 ratio of diluted rosemary extract (i.e. if the cell culture volume is 500ul, treat with 5ul diluted RE)</w:t>
       </w:r>
     </w:p>
     <w:p>
@@ -2336,35 +2023,7 @@
           <w:szCs w:val="24"/>
           <w:vertAlign w:val="baseline"/>
         </w:rPr>
-        <w:t xml:space="preserve">Culture the cells </w:t>
-      </w:r>
-      <w:r>
-        <w:rPr>
-          <w:b w:val="false"/>
-          <w:bCs w:val="false"/>
-          <w:i w:val="false"/>
-          <w:iCs w:val="false"/>
-          <w:position w:val="0"/>
-          <w:sz w:val="24"/>
-          <w:sz w:val="24"/>
-          <w:szCs w:val="24"/>
-          <w:vertAlign w:val="baseline"/>
-        </w:rPr>
-        <w:t>overnight in a shaker at</w:t>
-      </w:r>
-      <w:r>
-        <w:rPr>
-          <w:b w:val="false"/>
-          <w:bCs w:val="false"/>
-          <w:i w:val="false"/>
-          <w:iCs w:val="false"/>
-          <w:position w:val="0"/>
-          <w:sz w:val="24"/>
-          <w:sz w:val="24"/>
-          <w:szCs w:val="24"/>
-          <w:vertAlign w:val="baseline"/>
-        </w:rPr>
-        <w:t xml:space="preserve"> 37</w:t>
+        <w:t>Culture the cells overnight in a shaker at 37</w:t>
       </w:r>
       <w:r>
         <w:rPr>
@@ -2397,21 +2056,7 @@
           <w:szCs w:val="24"/>
           <w:vertAlign w:val="baseline"/>
         </w:rPr>
-        <w:t xml:space="preserve"> C </w:t>
-      </w:r>
-      <w:r>
-        <w:rPr>
-          <w:b w:val="false"/>
-          <w:bCs w:val="false"/>
-          <w:i w:val="false"/>
-          <w:iCs w:val="false"/>
-          <w:position w:val="0"/>
-          <w:sz w:val="24"/>
-          <w:sz w:val="24"/>
-          <w:szCs w:val="24"/>
-          <w:vertAlign w:val="baseline"/>
-        </w:rPr>
-        <w:t>@ 225rpm</w:t>
+        <w:t xml:space="preserve"> C @ 225rpm</w:t>
       </w:r>
     </w:p>
     <w:p>
@@ -2433,7 +2078,7 @@
       <w:pPr>
         <w:pStyle w:val="Normal"/>
         <w:bidi w:val="0"/>
-        <w:spacing w:lineRule="auto" w:line="360"/>
+        <w:spacing w:lineRule="auto" w:line="360" w:before="0" w:after="0"/>
         <w:jc w:val="left"/>
         <w:rPr/>
       </w:pPr>
@@ -2597,25 +2242,7 @@
           <w:i w:val="false"/>
           <w:iCs w:val="false"/>
         </w:rPr>
-        <w:t xml:space="preserve">look at the cells in a hemocytometer and calculate the total number of </w:t>
-      </w:r>
-      <w:r>
-        <w:rPr>
-          <w:b w:val="false"/>
-          <w:bCs w:val="false"/>
-          <w:i w:val="false"/>
-          <w:iCs w:val="false"/>
-        </w:rPr>
-        <w:t xml:space="preserve">living and dead </w:t>
-      </w:r>
-      <w:r>
-        <w:rPr>
-          <w:b w:val="false"/>
-          <w:bCs w:val="false"/>
-          <w:i w:val="false"/>
-          <w:iCs w:val="false"/>
-        </w:rPr>
-        <w:t>cells</w:t>
+        <w:t>look at the cells in a hemocytometer and calculate the total number of living and dead cells</w:t>
       </w:r>
       <w:r>
         <w:rPr>
@@ -2654,7 +2281,33 @@
           <w:sz w:val="24"/>
           <w:vertAlign w:val="baseline"/>
         </w:rPr>
-        <w:t>Thuroughly vortex cell suspension and immediately pipette 50ul into a tube</w:t>
+        <w:t xml:space="preserve">Thuroughly vortex cell suspension and immediately pipette </w:t>
+      </w:r>
+      <w:r>
+        <w:rPr>
+          <w:b w:val="false"/>
+          <w:bCs w:val="false"/>
+          <w:i w:val="false"/>
+          <w:iCs w:val="false"/>
+          <w:position w:val="0"/>
+          <w:sz w:val="24"/>
+          <w:sz w:val="24"/>
+          <w:vertAlign w:val="baseline"/>
+        </w:rPr>
+        <w:t>4</w:t>
+      </w:r>
+      <w:r>
+        <w:rPr>
+          <w:b w:val="false"/>
+          <w:bCs w:val="false"/>
+          <w:i w:val="false"/>
+          <w:iCs w:val="false"/>
+          <w:position w:val="0"/>
+          <w:sz w:val="24"/>
+          <w:sz w:val="24"/>
+          <w:vertAlign w:val="baseline"/>
+        </w:rPr>
+        <w:t>0ul into a tube</w:t>
       </w:r>
     </w:p>
     <w:p>
@@ -2680,7 +2333,33 @@
           <w:sz w:val="24"/>
           <w:vertAlign w:val="baseline"/>
         </w:rPr>
-        <w:t>add 25ul clean cell culture media into the same tube</w:t>
+        <w:t>add 2</w:t>
+      </w:r>
+      <w:r>
+        <w:rPr>
+          <w:b w:val="false"/>
+          <w:bCs w:val="false"/>
+          <w:i w:val="false"/>
+          <w:iCs w:val="false"/>
+          <w:position w:val="0"/>
+          <w:sz w:val="24"/>
+          <w:sz w:val="24"/>
+          <w:vertAlign w:val="baseline"/>
+        </w:rPr>
+        <w:t>0</w:t>
+      </w:r>
+      <w:r>
+        <w:rPr>
+          <w:b w:val="false"/>
+          <w:bCs w:val="false"/>
+          <w:i w:val="false"/>
+          <w:iCs w:val="false"/>
+          <w:position w:val="0"/>
+          <w:sz w:val="24"/>
+          <w:sz w:val="24"/>
+          <w:vertAlign w:val="baseline"/>
+        </w:rPr>
+        <w:t>ul clean cell culture media into the same tube</w:t>
       </w:r>
     </w:p>
     <w:p>
@@ -2706,7 +2385,33 @@
           <w:sz w:val="24"/>
           <w:vertAlign w:val="baseline"/>
         </w:rPr>
-        <w:t>add 25ul Trypan Blue into the same tube</w:t>
+        <w:t>add 2</w:t>
+      </w:r>
+      <w:r>
+        <w:rPr>
+          <w:b w:val="false"/>
+          <w:bCs w:val="false"/>
+          <w:i w:val="false"/>
+          <w:iCs w:val="false"/>
+          <w:position w:val="0"/>
+          <w:sz w:val="24"/>
+          <w:sz w:val="24"/>
+          <w:vertAlign w:val="baseline"/>
+        </w:rPr>
+        <w:t>0</w:t>
+      </w:r>
+      <w:r>
+        <w:rPr>
+          <w:b w:val="false"/>
+          <w:bCs w:val="false"/>
+          <w:i w:val="false"/>
+          <w:iCs w:val="false"/>
+          <w:position w:val="0"/>
+          <w:sz w:val="24"/>
+          <w:sz w:val="24"/>
+          <w:vertAlign w:val="baseline"/>
+        </w:rPr>
+        <w:t>ul Trypan Blue into the same tube</w:t>
       </w:r>
     </w:p>
     <w:p>
@@ -2784,20 +2489,7 @@
           <w:sz w:val="24"/>
           <w:vertAlign w:val="baseline"/>
         </w:rPr>
-        <w:t xml:space="preserve">vortex and immediately add 10ul of stained cells into the hemocytometer </w:t>
-      </w:r>
-      <w:r>
-        <w:rPr>
-          <w:b w:val="false"/>
-          <w:bCs w:val="false"/>
-          <w:i w:val="false"/>
-          <w:iCs w:val="false"/>
-          <w:position w:val="0"/>
-          <w:sz w:val="24"/>
-          <w:sz w:val="24"/>
-          <w:vertAlign w:val="baseline"/>
-        </w:rPr>
-        <w:t>using the v-shaped notch on the side of the hemocytometer</w:t>
+        <w:t>vortex and immediately add 10ul of stained cells into the hemocytometer using the v-shaped notch on the side of the hemocytometer</w:t>
       </w:r>
     </w:p>
     <w:p>
@@ -2823,59 +2515,7 @@
           <w:sz w:val="24"/>
           <w:vertAlign w:val="baseline"/>
         </w:rPr>
-        <w:t xml:space="preserve">count the number of </w:t>
-      </w:r>
-      <w:r>
-        <w:rPr>
-          <w:b w:val="false"/>
-          <w:bCs w:val="false"/>
-          <w:i w:val="false"/>
-          <w:iCs w:val="false"/>
-          <w:position w:val="0"/>
-          <w:sz w:val="24"/>
-          <w:sz w:val="24"/>
-          <w:vertAlign w:val="baseline"/>
-        </w:rPr>
-        <w:t xml:space="preserve">blue </w:t>
-      </w:r>
-      <w:r>
-        <w:rPr>
-          <w:b w:val="false"/>
-          <w:bCs w:val="false"/>
-          <w:i w:val="false"/>
-          <w:iCs w:val="false"/>
-          <w:position w:val="0"/>
-          <w:sz w:val="24"/>
-          <w:sz w:val="24"/>
-          <w:vertAlign w:val="baseline"/>
-        </w:rPr>
-        <w:t xml:space="preserve">cells </w:t>
-      </w:r>
-      <w:r>
-        <w:rPr>
-          <w:b w:val="false"/>
-          <w:bCs w:val="false"/>
-          <w:i w:val="false"/>
-          <w:iCs w:val="false"/>
-          <w:position w:val="0"/>
-          <w:sz w:val="24"/>
-          <w:sz w:val="24"/>
-          <w:vertAlign w:val="baseline"/>
-        </w:rPr>
-        <w:t>(dead cells) and clear cells (living cells)</w:t>
-      </w:r>
-      <w:r>
-        <w:rPr>
-          <w:b w:val="false"/>
-          <w:bCs w:val="false"/>
-          <w:i w:val="false"/>
-          <w:iCs w:val="false"/>
-          <w:position w:val="0"/>
-          <w:sz w:val="24"/>
-          <w:sz w:val="24"/>
-          <w:vertAlign w:val="baseline"/>
-        </w:rPr>
-        <w:t xml:space="preserve"> in </w:t>
+        <w:t xml:space="preserve">count the number of blue cells (dead cells) and clear cells (living cells) in </w:t>
       </w:r>
       <w:r>
         <w:rPr>
@@ -2953,7 +2593,59 @@
           <w:sz w:val="24"/>
           <w:vertAlign w:val="baseline"/>
         </w:rPr>
-        <w:t>multiply that number by 2 (because we diluted 50ul cells in 100ul final volume, our dilution factor is 2)</w:t>
+        <w:t xml:space="preserve">multiply that number by 2 (because we diluted </w:t>
+      </w:r>
+      <w:r>
+        <w:rPr>
+          <w:b w:val="false"/>
+          <w:bCs w:val="false"/>
+          <w:i w:val="false"/>
+          <w:iCs w:val="false"/>
+          <w:position w:val="0"/>
+          <w:sz w:val="24"/>
+          <w:sz w:val="24"/>
+          <w:vertAlign w:val="baseline"/>
+        </w:rPr>
+        <w:t>4</w:t>
+      </w:r>
+      <w:r>
+        <w:rPr>
+          <w:b w:val="false"/>
+          <w:bCs w:val="false"/>
+          <w:i w:val="false"/>
+          <w:iCs w:val="false"/>
+          <w:position w:val="0"/>
+          <w:sz w:val="24"/>
+          <w:sz w:val="24"/>
+          <w:vertAlign w:val="baseline"/>
+        </w:rPr>
+        <w:t xml:space="preserve">0ul cells in </w:t>
+      </w:r>
+      <w:r>
+        <w:rPr>
+          <w:b w:val="false"/>
+          <w:bCs w:val="false"/>
+          <w:i w:val="false"/>
+          <w:iCs w:val="false"/>
+          <w:position w:val="0"/>
+          <w:sz w:val="24"/>
+          <w:sz w:val="24"/>
+          <w:vertAlign w:val="baseline"/>
+        </w:rPr>
+        <w:t>8</w:t>
+      </w:r>
+      <w:r>
+        <w:rPr>
+          <w:b w:val="false"/>
+          <w:bCs w:val="false"/>
+          <w:i w:val="false"/>
+          <w:iCs w:val="false"/>
+          <w:position w:val="0"/>
+          <w:sz w:val="24"/>
+          <w:sz w:val="24"/>
+          <w:vertAlign w:val="baseline"/>
+        </w:rPr>
+        <w:t>0ul final volume, our dilution factor is 2)</w:t>
       </w:r>
     </w:p>
     <w:p>

</xml_diff>

<commit_message>
changed from 15 mins to 5 mins wait time
</commit_message>
<xml_diff>
--- a/cheek_cell_culture_protocol.docx
+++ b/cheek_cell_culture_protocol.docx
@@ -12,11 +12,7 @@
       </w:pPr>
       <w:r>
         <w:rPr/>
-        <w:t>Cheek Cell Culture + H2O2 Treatment Protocol v1.0.</w:t>
-      </w:r>
-      <w:r>
-        <w:rPr/>
-        <w:t>1</w:t>
+        <w:t>Cheek Cell Culture + H2O2 Treatment Protocol v1.0.1</w:t>
       </w:r>
     </w:p>
     <w:p>
@@ -247,16 +243,7 @@
           <w:iCs/>
         </w:rPr>
         <w:tab/>
-        <w:t xml:space="preserve">- </w:t>
-      </w:r>
-      <w:r>
-        <w:rPr>
-          <w:b w:val="false"/>
-          <w:bCs w:val="false"/>
-          <w:i/>
-          <w:iCs/>
-        </w:rPr>
-        <w:t>sterile toothpicks</w:t>
+        <w:t>- sterile toothpicks</w:t>
       </w:r>
     </w:p>
     <w:p>
@@ -435,14 +422,7 @@
           <w:b w:val="false"/>
           <w:bCs w:val="false"/>
         </w:rPr>
-        <w:t xml:space="preserve">Gently rub the inside of your cheeks with a steril toothpick </w:t>
-      </w:r>
-      <w:r>
-        <w:rPr>
-          <w:b w:val="false"/>
-          <w:bCs w:val="false"/>
-        </w:rPr>
-        <w:t>for 60s</w:t>
+        <w:t>Gently rub the inside of your cheeks with a steril toothpick for 60s</w:t>
       </w:r>
     </w:p>
     <w:p>
@@ -515,7 +495,25 @@
           <w:i w:val="false"/>
           <w:iCs w:val="false"/>
         </w:rPr>
-        <w:t>Wait 15 minutes, and repeat steps 1-4 for a total of two collections.</w:t>
+        <w:t xml:space="preserve">Wait </w:t>
+      </w:r>
+      <w:r>
+        <w:rPr>
+          <w:b w:val="false"/>
+          <w:bCs w:val="false"/>
+          <w:i w:val="false"/>
+          <w:iCs w:val="false"/>
+        </w:rPr>
+        <w:t>5</w:t>
+      </w:r>
+      <w:r>
+        <w:rPr>
+          <w:b w:val="false"/>
+          <w:bCs w:val="false"/>
+          <w:i w:val="false"/>
+          <w:iCs w:val="false"/>
+        </w:rPr>
+        <w:t xml:space="preserve"> minutes, and repeat steps 1-4 for a total of two collections.</w:t>
       </w:r>
     </w:p>
     <w:p>
@@ -620,33 +618,7 @@
           <w:sz w:val="24"/>
           <w:vertAlign w:val="baseline"/>
         </w:rPr>
-        <w:t xml:space="preserve">Thuroughly vortex cell suspension and immediately pipette </w:t>
-      </w:r>
-      <w:r>
-        <w:rPr>
-          <w:b w:val="false"/>
-          <w:bCs w:val="false"/>
-          <w:i w:val="false"/>
-          <w:iCs w:val="false"/>
-          <w:position w:val="0"/>
-          <w:sz w:val="24"/>
-          <w:sz w:val="24"/>
-          <w:vertAlign w:val="baseline"/>
-        </w:rPr>
-        <w:t>4</w:t>
-      </w:r>
-      <w:r>
-        <w:rPr>
-          <w:b w:val="false"/>
-          <w:bCs w:val="false"/>
-          <w:i w:val="false"/>
-          <w:iCs w:val="false"/>
-          <w:position w:val="0"/>
-          <w:sz w:val="24"/>
-          <w:sz w:val="24"/>
-          <w:vertAlign w:val="baseline"/>
-        </w:rPr>
-        <w:t>0ul into a tube</w:t>
+        <w:t>Thuroughly vortex cell suspension and immediately pipette 40ul into a tube</w:t>
       </w:r>
     </w:p>
     <w:p>
@@ -672,33 +644,7 @@
           <w:sz w:val="24"/>
           <w:vertAlign w:val="baseline"/>
         </w:rPr>
-        <w:t>add 2</w:t>
-      </w:r>
-      <w:r>
-        <w:rPr>
-          <w:b w:val="false"/>
-          <w:bCs w:val="false"/>
-          <w:i w:val="false"/>
-          <w:iCs w:val="false"/>
-          <w:position w:val="0"/>
-          <w:sz w:val="24"/>
-          <w:sz w:val="24"/>
-          <w:vertAlign w:val="baseline"/>
-        </w:rPr>
-        <w:t>0</w:t>
-      </w:r>
-      <w:r>
-        <w:rPr>
-          <w:b w:val="false"/>
-          <w:bCs w:val="false"/>
-          <w:i w:val="false"/>
-          <w:iCs w:val="false"/>
-          <w:position w:val="0"/>
-          <w:sz w:val="24"/>
-          <w:sz w:val="24"/>
-          <w:vertAlign w:val="baseline"/>
-        </w:rPr>
-        <w:t>ul clean cell culture media into the same tube</w:t>
+        <w:t>add 20ul clean cell culture media into the same tube</w:t>
       </w:r>
     </w:p>
     <w:p>
@@ -724,33 +670,7 @@
           <w:sz w:val="24"/>
           <w:vertAlign w:val="baseline"/>
         </w:rPr>
-        <w:t>add 2</w:t>
-      </w:r>
-      <w:r>
-        <w:rPr>
-          <w:b w:val="false"/>
-          <w:bCs w:val="false"/>
-          <w:i w:val="false"/>
-          <w:iCs w:val="false"/>
-          <w:position w:val="0"/>
-          <w:sz w:val="24"/>
-          <w:sz w:val="24"/>
-          <w:vertAlign w:val="baseline"/>
-        </w:rPr>
-        <w:t>0</w:t>
-      </w:r>
-      <w:r>
-        <w:rPr>
-          <w:b w:val="false"/>
-          <w:bCs w:val="false"/>
-          <w:i w:val="false"/>
-          <w:iCs w:val="false"/>
-          <w:position w:val="0"/>
-          <w:sz w:val="24"/>
-          <w:sz w:val="24"/>
-          <w:vertAlign w:val="baseline"/>
-        </w:rPr>
-        <w:t>ul Trypan Blue into the same tube</w:t>
+        <w:t>add 20ul Trypan Blue into the same tube</w:t>
       </w:r>
     </w:p>
     <w:p>
@@ -906,59 +826,7 @@
           <w:sz w:val="24"/>
           <w:vertAlign w:val="baseline"/>
         </w:rPr>
-        <w:t xml:space="preserve">multiply that number by 2 (because we diluted </w:t>
-      </w:r>
-      <w:r>
-        <w:rPr>
-          <w:b w:val="false"/>
-          <w:bCs w:val="false"/>
-          <w:i w:val="false"/>
-          <w:iCs w:val="false"/>
-          <w:position w:val="0"/>
-          <w:sz w:val="24"/>
-          <w:sz w:val="24"/>
-          <w:vertAlign w:val="baseline"/>
-        </w:rPr>
-        <w:t>4</w:t>
-      </w:r>
-      <w:r>
-        <w:rPr>
-          <w:b w:val="false"/>
-          <w:bCs w:val="false"/>
-          <w:i w:val="false"/>
-          <w:iCs w:val="false"/>
-          <w:position w:val="0"/>
-          <w:sz w:val="24"/>
-          <w:sz w:val="24"/>
-          <w:vertAlign w:val="baseline"/>
-        </w:rPr>
-        <w:t xml:space="preserve">0ul cells in </w:t>
-      </w:r>
-      <w:r>
-        <w:rPr>
-          <w:b w:val="false"/>
-          <w:bCs w:val="false"/>
-          <w:i w:val="false"/>
-          <w:iCs w:val="false"/>
-          <w:position w:val="0"/>
-          <w:sz w:val="24"/>
-          <w:sz w:val="24"/>
-          <w:vertAlign w:val="baseline"/>
-        </w:rPr>
-        <w:t>80</w:t>
-      </w:r>
-      <w:r>
-        <w:rPr>
-          <w:b w:val="false"/>
-          <w:bCs w:val="false"/>
-          <w:i w:val="false"/>
-          <w:iCs w:val="false"/>
-          <w:position w:val="0"/>
-          <w:sz w:val="24"/>
-          <w:sz w:val="24"/>
-          <w:vertAlign w:val="baseline"/>
-        </w:rPr>
-        <w:t>ul final volume, our dilution factor is 2)</w:t>
+        <w:t>multiply that number by 2 (because we diluted 40ul cells in 80ul final volume, our dilution factor is 2)</w:t>
       </w:r>
     </w:p>
     <w:p>
@@ -2281,33 +2149,7 @@
           <w:sz w:val="24"/>
           <w:vertAlign w:val="baseline"/>
         </w:rPr>
-        <w:t xml:space="preserve">Thuroughly vortex cell suspension and immediately pipette </w:t>
-      </w:r>
-      <w:r>
-        <w:rPr>
-          <w:b w:val="false"/>
-          <w:bCs w:val="false"/>
-          <w:i w:val="false"/>
-          <w:iCs w:val="false"/>
-          <w:position w:val="0"/>
-          <w:sz w:val="24"/>
-          <w:sz w:val="24"/>
-          <w:vertAlign w:val="baseline"/>
-        </w:rPr>
-        <w:t>4</w:t>
-      </w:r>
-      <w:r>
-        <w:rPr>
-          <w:b w:val="false"/>
-          <w:bCs w:val="false"/>
-          <w:i w:val="false"/>
-          <w:iCs w:val="false"/>
-          <w:position w:val="0"/>
-          <w:sz w:val="24"/>
-          <w:sz w:val="24"/>
-          <w:vertAlign w:val="baseline"/>
-        </w:rPr>
-        <w:t>0ul into a tube</w:t>
+        <w:t>Thuroughly vortex cell suspension and immediately pipette 40ul into a tube</w:t>
       </w:r>
     </w:p>
     <w:p>
@@ -2333,33 +2175,7 @@
           <w:sz w:val="24"/>
           <w:vertAlign w:val="baseline"/>
         </w:rPr>
-        <w:t>add 2</w:t>
-      </w:r>
-      <w:r>
-        <w:rPr>
-          <w:b w:val="false"/>
-          <w:bCs w:val="false"/>
-          <w:i w:val="false"/>
-          <w:iCs w:val="false"/>
-          <w:position w:val="0"/>
-          <w:sz w:val="24"/>
-          <w:sz w:val="24"/>
-          <w:vertAlign w:val="baseline"/>
-        </w:rPr>
-        <w:t>0</w:t>
-      </w:r>
-      <w:r>
-        <w:rPr>
-          <w:b w:val="false"/>
-          <w:bCs w:val="false"/>
-          <w:i w:val="false"/>
-          <w:iCs w:val="false"/>
-          <w:position w:val="0"/>
-          <w:sz w:val="24"/>
-          <w:sz w:val="24"/>
-          <w:vertAlign w:val="baseline"/>
-        </w:rPr>
-        <w:t>ul clean cell culture media into the same tube</w:t>
+        <w:t>add 20ul clean cell culture media into the same tube</w:t>
       </w:r>
     </w:p>
     <w:p>
@@ -2385,33 +2201,7 @@
           <w:sz w:val="24"/>
           <w:vertAlign w:val="baseline"/>
         </w:rPr>
-        <w:t>add 2</w:t>
-      </w:r>
-      <w:r>
-        <w:rPr>
-          <w:b w:val="false"/>
-          <w:bCs w:val="false"/>
-          <w:i w:val="false"/>
-          <w:iCs w:val="false"/>
-          <w:position w:val="0"/>
-          <w:sz w:val="24"/>
-          <w:sz w:val="24"/>
-          <w:vertAlign w:val="baseline"/>
-        </w:rPr>
-        <w:t>0</w:t>
-      </w:r>
-      <w:r>
-        <w:rPr>
-          <w:b w:val="false"/>
-          <w:bCs w:val="false"/>
-          <w:i w:val="false"/>
-          <w:iCs w:val="false"/>
-          <w:position w:val="0"/>
-          <w:sz w:val="24"/>
-          <w:sz w:val="24"/>
-          <w:vertAlign w:val="baseline"/>
-        </w:rPr>
-        <w:t>ul Trypan Blue into the same tube</w:t>
+        <w:t>add 20ul Trypan Blue into the same tube</w:t>
       </w:r>
     </w:p>
     <w:p>
@@ -2593,59 +2383,7 @@
           <w:sz w:val="24"/>
           <w:vertAlign w:val="baseline"/>
         </w:rPr>
-        <w:t xml:space="preserve">multiply that number by 2 (because we diluted </w:t>
-      </w:r>
-      <w:r>
-        <w:rPr>
-          <w:b w:val="false"/>
-          <w:bCs w:val="false"/>
-          <w:i w:val="false"/>
-          <w:iCs w:val="false"/>
-          <w:position w:val="0"/>
-          <w:sz w:val="24"/>
-          <w:sz w:val="24"/>
-          <w:vertAlign w:val="baseline"/>
-        </w:rPr>
-        <w:t>4</w:t>
-      </w:r>
-      <w:r>
-        <w:rPr>
-          <w:b w:val="false"/>
-          <w:bCs w:val="false"/>
-          <w:i w:val="false"/>
-          <w:iCs w:val="false"/>
-          <w:position w:val="0"/>
-          <w:sz w:val="24"/>
-          <w:sz w:val="24"/>
-          <w:vertAlign w:val="baseline"/>
-        </w:rPr>
-        <w:t xml:space="preserve">0ul cells in </w:t>
-      </w:r>
-      <w:r>
-        <w:rPr>
-          <w:b w:val="false"/>
-          <w:bCs w:val="false"/>
-          <w:i w:val="false"/>
-          <w:iCs w:val="false"/>
-          <w:position w:val="0"/>
-          <w:sz w:val="24"/>
-          <w:sz w:val="24"/>
-          <w:vertAlign w:val="baseline"/>
-        </w:rPr>
-        <w:t>8</w:t>
-      </w:r>
-      <w:r>
-        <w:rPr>
-          <w:b w:val="false"/>
-          <w:bCs w:val="false"/>
-          <w:i w:val="false"/>
-          <w:iCs w:val="false"/>
-          <w:position w:val="0"/>
-          <w:sz w:val="24"/>
-          <w:sz w:val="24"/>
-          <w:vertAlign w:val="baseline"/>
-        </w:rPr>
-        <w:t>0ul final volume, our dilution factor is 2)</w:t>
+        <w:t>multiply that number by 2 (because we diluted 40ul cells in 80ul final volume, our dilution factor is 2)</w:t>
       </w:r>
     </w:p>
     <w:p>

</xml_diff>

<commit_message>
forgot to update version number
</commit_message>
<xml_diff>
--- a/cheek_cell_culture_protocol.docx
+++ b/cheek_cell_culture_protocol.docx
@@ -12,7 +12,11 @@
       </w:pPr>
       <w:r>
         <w:rPr/>
-        <w:t>Cheek Cell Culture + H2O2 Treatment Protocol v1.0.1</w:t>
+        <w:t>Cheek Cell Culture + H2O2 Treatment Protocol v1.0.</w:t>
+      </w:r>
+      <w:r>
+        <w:rPr/>
+        <w:t>2</w:t>
       </w:r>
     </w:p>
     <w:p>
@@ -495,25 +499,7 @@
           <w:i w:val="false"/>
           <w:iCs w:val="false"/>
         </w:rPr>
-        <w:t xml:space="preserve">Wait </w:t>
-      </w:r>
-      <w:r>
-        <w:rPr>
-          <w:b w:val="false"/>
-          <w:bCs w:val="false"/>
-          <w:i w:val="false"/>
-          <w:iCs w:val="false"/>
-        </w:rPr>
-        <w:t>5</w:t>
-      </w:r>
-      <w:r>
-        <w:rPr>
-          <w:b w:val="false"/>
-          <w:bCs w:val="false"/>
-          <w:i w:val="false"/>
-          <w:iCs w:val="false"/>
-        </w:rPr>
-        <w:t xml:space="preserve"> minutes, and repeat steps 1-4 for a total of two collections.</w:t>
+        <w:t>Wait 5 minutes, and repeat steps 1-4 for a total of two collections.</w:t>
       </w:r>
     </w:p>
     <w:p>

</xml_diff>